<commit_message>
feat(resume): rewrite role descriptions from LinkedIn detail
Replace the placeholder role descriptions with ones paraphrased from the
LinkedIn profile detail the user supplied, which is substantially richer
than either the website or the PDF: the three-property portfolio and
24-hour on-call response, pandemic-shifted lending conditions and
mentoring, the legal-to-business interface on liquidation, sole
accountability across the foreclosure-prevention lifecycle, and the $1.2M
build with volunteers from C-suite executives to military personnel.

Wording is paraphrased rather than lifted, and each description is held to
a single line. A first pass wrapped all five to two lines and pushed the
document to three pages; trimming to roughly 105 characters each restored
two pages without dropping content.

Co-Authored-By: Claude Opus 5 (1M context) <noreply@anthropic.com>
</commit_message>
<xml_diff>
--- a/_source/Carl_Lochstampfor_Resume.docx
+++ b/_source/Carl_Lochstampfor_Resume.docx
@@ -1126,7 +1126,7 @@
           <w:sz w:val="21"/>
           <w:szCs w:val="21"/>
         </w:rPr>
-        <w:t>Owner-operator role spanning property portfolio management and fiduciary administration of two private estates.</w:t>
+        <w:t>Self-employed operator of a three-property rental portfolio, plus probate administration for two estates.</w:t>
       </w:r>
     </w:p>
     <w:p>
@@ -1243,7 +1243,7 @@
           <w:sz w:val="21"/>
           <w:szCs w:val="21"/>
         </w:rPr>
-        <w:t>Evaluated distressed-borrower files for foreclosure-relief eligibility and redesigned loan origination workflows to improve data integrity.</w:t>
+        <w:t>Underwrote foreclosure-relief mortgages amid pandemic-shifted lending conditions; mentored new underwriters.</w:t>
       </w:r>
     </w:p>
     <w:p>
@@ -1328,7 +1328,7 @@
           <w:sz w:val="21"/>
           <w:szCs w:val="21"/>
         </w:rPr>
-        <w:t>Reviewed complex loan files for federal compliance, mitigating risk exposure across a high-volume loss mitigation portfolio.</w:t>
+        <w:t>Assessed loss-mitigation files for risk and requirement discrepancies, interfacing legal and business units.</w:t>
       </w:r>
     </w:p>
     <w:p>
@@ -1477,7 +1477,7 @@
           <w:sz w:val="21"/>
           <w:szCs w:val="21"/>
         </w:rPr>
-        <w:t>Single Point of Contact for homeowners navigating foreclosure prevention in a regulated mortgage servicing environment.</w:t>
+        <w:t>Sole point of accountability for borrower and third-party foreclosure-prevention inquiries.</w:t>
       </w:r>
     </w:p>
     <w:p>
@@ -1561,7 +1561,7 @@
           <w:sz w:val="21"/>
           <w:szCs w:val="21"/>
         </w:rPr>
-        <w:t>Led residential build crews and provided financial wellness and recovery coaching across diverse volunteer populations.</w:t>
+        <w:t>Led volunteer crews from C-suite executives to military personnel on a $1.2M residential build.</w:t>
       </w:r>
     </w:p>
     <w:p>

</xml_diff>

<commit_message>
fix(resume): replace BlueHub bullet with work the profile documents
The first BlueHub bullet claimed support for internal bank examinations
and compliance audits. Nothing in that role's LinkedIn entry mentions
examinations or audits; that work sits closer to the TIAA position.
Replace it with the workflow revision the profile does describe --
adapting underwriting and loan processing to rapidly shifting economic
and pandemic-driven demand.

Re-cut the role description alongside it so the three items divide
cleanly: description carries scope and mentoring, the first bullet the
workflow revision, the second the SMS platform deployment.

Company naming and both AmeriCorps claims were confirmed correct as-is
and left unchanged.

Co-Authored-By: Claude Opus 5 (1M context) <noreply@anthropic.com>
</commit_message>
<xml_diff>
--- a/_source/Carl_Lochstampfor_Resume.docx
+++ b/_source/Carl_Lochstampfor_Resume.docx
@@ -1243,7 +1243,7 @@
           <w:sz w:val="21"/>
           <w:szCs w:val="21"/>
         </w:rPr>
-        <w:t>Underwrote foreclosure-relief mortgages amid pandemic-shifted lending conditions; mentored new underwriters.</w:t>
+        <w:t>Underwrote foreclosure-relief mortgages for distressed homeowners; trained and mentored new underwriters.</w:t>
       </w:r>
     </w:p>
     <w:p>
@@ -1260,7 +1260,7 @@
           <w:sz w:val="21"/>
           <w:szCs w:val="21"/>
         </w:rPr>
-        <w:t>Supported internal bank examinations and compliance audits, safeguarding corporate financial interests through strict adherence to regulatory standards.</w:t>
+        <w:t>Revised underwriting and loan-processing workflows to meet rapidly shifting economic and pandemic-driven demand, sustaining operational efficiency.</w:t>
       </w:r>
     </w:p>
     <w:p>

</xml_diff>

<commit_message>
feat(resume): add confidentiality bullet to SPOC role
The EverBank & Ditech entry carried one bullet where every other role had
two. Add the confidentiality item from the LinkedIn profile -- handling
sensitive financial information and legal documentation across the
foreclosure lifecycle -- with the "100%" figure dropped at the author's
direction.

Word's Style property does not carry list membership on its own: the new
paragraph first rendered as plain text with no bullet glyph, misaligned
against its sibling. Applying the reference paragraph's ListTemplate via
ApplyListTemplateWithLevel and matching its indents fixed it.

Still two pages.

Co-Authored-By: Claude Opus 5 (1M context) <noreply@anthropic.com>
</commit_message>
<xml_diff>
--- a/_source/Carl_Lochstampfor_Resume.docx
+++ b/_source/Carl_Lochstampfor_Resume.docx
@@ -1511,6 +1511,25 @@
           <w:szCs w:val="21"/>
         </w:rPr>
         <w:t xml:space="preserve"> through workflow optimization.</w:t>
+      </w:r>
+    </w:p>
+    <w:p>
+      <w:pPr>
+        <w:pStyle w:val="ListParagraph"/>
+        <w:numPr>
+          <w:ilvl w:val="0"/>
+          <w:numId w:val="3"/>
+        </w:numPr>
+        <w:spacing w:after="40"/>
+        <w:rPr>
+          <w:sz w:val="21"/>
+        </w:rPr>
+      </w:pPr>
+      <w:r>
+        <w:rPr>
+          <w:sz w:val="21"/>
+        </w:rPr>
+        <w:t>Maintained confidentiality and accuracy while handling sensitive financial information and legal documentation throughout the foreclosure lifecycle.</w:t>
       </w:r>
     </w:p>
     <w:p>
@@ -1722,6 +1741,92 @@
 <file path=word/numbering.xml><?xml version="1.0" encoding="utf-8"?>
 <w:numbering xmlns:wpc="http://schemas.microsoft.com/office/word/2010/wordprocessingCanvas" xmlns:cx="http://schemas.microsoft.com/office/drawing/2014/chartex" xmlns:cx1="http://schemas.microsoft.com/office/drawing/2015/9/8/chartex" xmlns:cx2="http://schemas.microsoft.com/office/drawing/2015/10/21/chartex" xmlns:cx3="http://schemas.microsoft.com/office/drawing/2016/5/9/chartex" xmlns:cx4="http://schemas.microsoft.com/office/drawing/2016/5/10/chartex" xmlns:cx5="http://schemas.microsoft.com/office/drawing/2016/5/11/chartex" xmlns:cx6="http://schemas.microsoft.com/office/drawing/2016/5/12/chartex" xmlns:cx7="http://schemas.microsoft.com/office/drawing/2016/5/13/chartex" xmlns:cx8="http://schemas.microsoft.com/office/drawing/2016/5/14/chartex" xmlns:mc="http://schemas.openxmlformats.org/markup-compatibility/2006" xmlns:aink="http://schemas.microsoft.com/office/drawing/2016/ink" xmlns:am3d="http://schemas.microsoft.com/office/drawing/2017/model3d" xmlns:o="urn:schemas-microsoft-com:office:office" xmlns:oel="http://schemas.microsoft.com/office/2019/extlst" xmlns:r="http://schemas.openxmlformats.org/officeDocument/2006/relationships" xmlns:m="http://schemas.openxmlformats.org/officeDocument/2006/math" xmlns:v="urn:schemas-microsoft-com:vml" xmlns:wp14="http://schemas.microsoft.com/office/word/2010/wordprocessingDrawing" xmlns:wp="http://schemas.openxmlformats.org/drawingml/2006/wordprocessingDrawing" xmlns:w10="urn:schemas-microsoft-com:office:word" xmlns:w="http://schemas.openxmlformats.org/wordprocessingml/2006/main" xmlns:w14="http://schemas.microsoft.com/office/word/2010/wordml" xmlns:w15="http://schemas.microsoft.com/office/word/2012/wordml" xmlns:w16cex="http://schemas.microsoft.com/office/word/2018/wordml/cex" xmlns:w16cid="http://schemas.microsoft.com/office/word/2016/wordml/cid" xmlns:w16="http://schemas.microsoft.com/office/word/2018/wordml" xmlns:w16du="http://schemas.microsoft.com/office/word/2023/wordml/word16du" xmlns:w16sdtdh="http://schemas.microsoft.com/office/word/2020/wordml/sdtdatahash" xmlns:w16sdtfl="http://schemas.microsoft.com/office/word/2024/wordml/sdtformatlock" xmlns:w16se="http://schemas.microsoft.com/office/word/2015/wordml/symex" xmlns:wpg="http://schemas.microsoft.com/office/word/2010/wordprocessingGroup" xmlns:wpi="http://schemas.microsoft.com/office/word/2010/wordprocessingInk" xmlns:wne="http://schemas.microsoft.com/office/word/2006/wordml" xmlns:wps="http://schemas.microsoft.com/office/word/2010/wordprocessingShape" mc:Ignorable="w14 w15 w16se w16cid w16 w16cex w16sdtdh w16sdtfl w16du wp14">
   <w:abstractNum w:abstractNumId="0" w15:restartNumberingAfterBreak="0">
+    <w:nsid w:val="1A223603"/>
+    <w:multiLevelType w:val="multilevel"/>
+    <w:tmpl w:val="0EE6043E"/>
+    <w:lvl w:ilvl="0">
+      <w:start w:val="1"/>
+      <w:numFmt w:val="bullet"/>
+      <w:lvlText w:val="●"/>
+      <w:lvlJc w:val="left"/>
+      <w:pPr>
+        <w:ind w:left="720" w:hanging="360"/>
+      </w:pPr>
+    </w:lvl>
+    <w:lvl w:ilvl="1">
+      <w:start w:val="1"/>
+      <w:numFmt w:val="bullet"/>
+      <w:lvlText w:val="○"/>
+      <w:lvlJc w:val="left"/>
+      <w:pPr>
+        <w:ind w:left="1440" w:hanging="360"/>
+      </w:pPr>
+    </w:lvl>
+    <w:lvl w:ilvl="2">
+      <w:start w:val="1"/>
+      <w:numFmt w:val="bullet"/>
+      <w:lvlText w:val="■"/>
+      <w:lvlJc w:val="left"/>
+      <w:pPr>
+        <w:ind w:left="2160" w:hanging="360"/>
+      </w:pPr>
+    </w:lvl>
+    <w:lvl w:ilvl="3">
+      <w:start w:val="1"/>
+      <w:numFmt w:val="bullet"/>
+      <w:lvlText w:val="●"/>
+      <w:lvlJc w:val="left"/>
+      <w:pPr>
+        <w:ind w:left="2880" w:hanging="360"/>
+      </w:pPr>
+    </w:lvl>
+    <w:lvl w:ilvl="4">
+      <w:start w:val="1"/>
+      <w:numFmt w:val="bullet"/>
+      <w:lvlText w:val="○"/>
+      <w:lvlJc w:val="left"/>
+      <w:pPr>
+        <w:ind w:left="3600" w:hanging="360"/>
+      </w:pPr>
+    </w:lvl>
+    <w:lvl w:ilvl="5">
+      <w:start w:val="1"/>
+      <w:numFmt w:val="bullet"/>
+      <w:lvlText w:val="■"/>
+      <w:lvlJc w:val="left"/>
+      <w:pPr>
+        <w:ind w:left="4320" w:hanging="360"/>
+      </w:pPr>
+    </w:lvl>
+    <w:lvl w:ilvl="6">
+      <w:start w:val="1"/>
+      <w:numFmt w:val="bullet"/>
+      <w:lvlText w:val="●"/>
+      <w:lvlJc w:val="left"/>
+      <w:pPr>
+        <w:ind w:left="5040" w:hanging="360"/>
+      </w:pPr>
+    </w:lvl>
+    <w:lvl w:ilvl="7">
+      <w:start w:val="1"/>
+      <w:numFmt w:val="bullet"/>
+      <w:lvlText w:val="●"/>
+      <w:lvlJc w:val="left"/>
+      <w:pPr>
+        <w:ind w:left="5760" w:hanging="360"/>
+      </w:pPr>
+    </w:lvl>
+    <w:lvl w:ilvl="8">
+      <w:start w:val="1"/>
+      <w:numFmt w:val="bullet"/>
+      <w:lvlText w:val="●"/>
+      <w:lvlJc w:val="left"/>
+      <w:pPr>
+        <w:ind w:left="6480" w:hanging="360"/>
+      </w:pPr>
+    </w:lvl>
+  </w:abstractNum>
+  <w:abstractNum w:abstractNumId="1" w15:restartNumberingAfterBreak="0">
     <w:nsid w:val="70472747"/>
     <w:multiLevelType w:val="hybridMultilevel"/>
     <w:tmpl w:val="0EE6043E"/>
@@ -1808,10 +1913,16 @@
     </w:lvl>
   </w:abstractNum>
   <w:num w:numId="1" w16cid:durableId="618336517">
-    <w:abstractNumId w:val="0"/>
+    <w:abstractNumId w:val="1"/>
     <w:lvlOverride w:ilvl="0">
       <w:startOverride w:val="1"/>
     </w:lvlOverride>
+  </w:num>
+  <w:num w:numId="2" w16cid:durableId="1187405654">
+    <w:abstractNumId w:val="1"/>
+  </w:num>
+  <w:num w:numId="3" w16cid:durableId="40861117">
+    <w:abstractNumId w:val="0"/>
   </w:num>
 </w:numbering>
 </file>

</xml_diff>

<commit_message>
feat(resume): split AmeriCorps bullet into two claims
The single bullet carried two distinct claims -- 150+ daily volunteers,
and 100+ homes delivered at 98% quality. Split so each stands on its own,
matching the two-bullet shape every other role now has. It costs nothing:
the combined bullet wrapped to two lines, so the split occupies the same
space and the document stays at two pages.

Job titles stay right-aligned rather than moving inline after a pipe. The
right column is scannable in one pass; inline, each title would sit at the
end of a different-length line, the Cardinal Housing entry would run to
the wrap limit, and the most important field in each block would read as
metadata trailing the location and dates.

Co-Authored-By: Claude Opus 5 (1M context) <noreply@anthropic.com>
</commit_message>
<xml_diff>
--- a/_source/Carl_Lochstampfor_Resume.docx
+++ b/_source/Carl_Lochstampfor_Resume.docx
@@ -1598,55 +1598,26 @@
           <w:sz w:val="21"/>
           <w:szCs w:val="21"/>
         </w:rPr>
-        <w:t xml:space="preserve">Supervised and motivated up to </w:t>
-      </w:r>
-      <w:r>
-        <w:rPr>
-          <w:b/>
-          <w:bCs/>
-          <w:sz w:val="21"/>
-          <w:szCs w:val="21"/>
-        </w:rPr>
-        <w:t>150+ volunteers per day</w:t>
-      </w:r>
-      <w:r>
-        <w:rPr>
-          <w:sz w:val="21"/>
-          <w:szCs w:val="21"/>
-        </w:rPr>
-        <w:t xml:space="preserve"> across multiple residential construction projects, delivering </w:t>
-      </w:r>
-      <w:r>
-        <w:rPr>
-          <w:b/>
-          <w:bCs/>
-          <w:sz w:val="21"/>
-          <w:szCs w:val="21"/>
-        </w:rPr>
-        <w:t>100+ completed homes</w:t>
-      </w:r>
-      <w:r>
-        <w:rPr>
-          <w:sz w:val="21"/>
-          <w:szCs w:val="21"/>
-        </w:rPr>
-        <w:t xml:space="preserve"> while maintaining </w:t>
-      </w:r>
-      <w:r>
-        <w:rPr>
-          <w:b/>
-          <w:bCs/>
-          <w:sz w:val="21"/>
-          <w:szCs w:val="21"/>
-        </w:rPr>
-        <w:t>98% quality standards</w:t>
-      </w:r>
-      <w:r>
-        <w:rPr>
-          <w:sz w:val="21"/>
-          <w:szCs w:val="21"/>
-        </w:rPr>
-        <w:t>.</w:t>
+        <w:t>Supervised and motivated up to 150+ volunteers per day across multiple residential construction projects.</w:t>
+      </w:r>
+    </w:p>
+    <w:p>
+      <w:pPr>
+        <w:pStyle w:val="ListParagraph"/>
+        <w:numPr>
+          <w:ilvl w:val="0"/>
+          <w:numId w:val="3"/>
+        </w:numPr>
+        <w:spacing w:after="40"/>
+        <w:rPr>
+          <w:sz w:val="21"/>
+        </w:rPr>
+      </w:pPr>
+      <w:r>
+        <w:rPr>
+          <w:sz w:val="21"/>
+        </w:rPr>
+        <w:t>Delivered 100+ completed homes while maintaining 98% quality standards.</w:t>
       </w:r>
     </w:p>
     <w:p>

</xml_diff>

<commit_message>
fix(resume): restore BlueHub compliance bullet on both site and PDF
v2.10.1 and v2.11.0 removed the claim about assisting in compliance
matters such as bank exams and audits, reasoning that it appears nowhere
in the LinkedIn entry. That reasoning was wrong. The 2023 resume states it
directly: "Assisted in compliance matters, such as bank exams and audits,
to protect the financial interests of the company, its investors, and
clients." LinkedIn is an abridged record, not the authoritative one.

Restored to both. Fitting it inside two pages meant tightening the
workflow bullet from two lines to one, trading a clause for a real claim.

Primerica Financial Services stays off deliberately: a failed opportunity
with no relevance to technical roles, and the resulting gap is one the
author is content to explain directly.

Co-Authored-By: Claude Opus 5 (1M context) <noreply@anthropic.com>
</commit_message>
<xml_diff>
--- a/_source/Carl_Lochstampfor_Resume.docx
+++ b/_source/Carl_Lochstampfor_Resume.docx
@@ -1260,7 +1260,7 @@
           <w:sz w:val="21"/>
           <w:szCs w:val="21"/>
         </w:rPr>
-        <w:t>Revised underwriting and loan-processing workflows to meet rapidly shifting economic and pandemic-driven demand, sustaining operational efficiency.</w:t>
+        <w:t>Revised underwriting and loan-processing workflows to meet rapidly shifting economic demand.</w:t>
       </w:r>
     </w:p>
     <w:p>
@@ -1278,6 +1278,25 @@
           <w:szCs w:val="21"/>
         </w:rPr>
         <w:t>Led research, vendor evaluation, and deployment of a secure SMS communication platform, maintaining data protection and compliance.</w:t>
+      </w:r>
+    </w:p>
+    <w:p>
+      <w:pPr>
+        <w:pStyle w:val="ListParagraph"/>
+        <w:numPr>
+          <w:ilvl w:val="0"/>
+          <w:numId w:val="4"/>
+        </w:numPr>
+        <w:spacing w:after="40"/>
+        <w:rPr>
+          <w:sz w:val="21"/>
+        </w:rPr>
+      </w:pPr>
+      <w:r>
+        <w:rPr>
+          <w:sz w:val="21"/>
+        </w:rPr>
+        <w:t>Assisted in compliance matters such as bank exams and audits, protecting investor and client interests.</w:t>
       </w:r>
     </w:p>
     <w:p>
@@ -1712,6 +1731,92 @@
 <file path=word/numbering.xml><?xml version="1.0" encoding="utf-8"?>
 <w:numbering xmlns:wpc="http://schemas.microsoft.com/office/word/2010/wordprocessingCanvas" xmlns:cx="http://schemas.microsoft.com/office/drawing/2014/chartex" xmlns:cx1="http://schemas.microsoft.com/office/drawing/2015/9/8/chartex" xmlns:cx2="http://schemas.microsoft.com/office/drawing/2015/10/21/chartex" xmlns:cx3="http://schemas.microsoft.com/office/drawing/2016/5/9/chartex" xmlns:cx4="http://schemas.microsoft.com/office/drawing/2016/5/10/chartex" xmlns:cx5="http://schemas.microsoft.com/office/drawing/2016/5/11/chartex" xmlns:cx6="http://schemas.microsoft.com/office/drawing/2016/5/12/chartex" xmlns:cx7="http://schemas.microsoft.com/office/drawing/2016/5/13/chartex" xmlns:cx8="http://schemas.microsoft.com/office/drawing/2016/5/14/chartex" xmlns:mc="http://schemas.openxmlformats.org/markup-compatibility/2006" xmlns:aink="http://schemas.microsoft.com/office/drawing/2016/ink" xmlns:am3d="http://schemas.microsoft.com/office/drawing/2017/model3d" xmlns:o="urn:schemas-microsoft-com:office:office" xmlns:oel="http://schemas.microsoft.com/office/2019/extlst" xmlns:r="http://schemas.openxmlformats.org/officeDocument/2006/relationships" xmlns:m="http://schemas.openxmlformats.org/officeDocument/2006/math" xmlns:v="urn:schemas-microsoft-com:vml" xmlns:wp14="http://schemas.microsoft.com/office/word/2010/wordprocessingDrawing" xmlns:wp="http://schemas.openxmlformats.org/drawingml/2006/wordprocessingDrawing" xmlns:w10="urn:schemas-microsoft-com:office:word" xmlns:w="http://schemas.openxmlformats.org/wordprocessingml/2006/main" xmlns:w14="http://schemas.microsoft.com/office/word/2010/wordml" xmlns:w15="http://schemas.microsoft.com/office/word/2012/wordml" xmlns:w16cex="http://schemas.microsoft.com/office/word/2018/wordml/cex" xmlns:w16cid="http://schemas.microsoft.com/office/word/2016/wordml/cid" xmlns:w16="http://schemas.microsoft.com/office/word/2018/wordml" xmlns:w16du="http://schemas.microsoft.com/office/word/2023/wordml/word16du" xmlns:w16sdtdh="http://schemas.microsoft.com/office/word/2020/wordml/sdtdatahash" xmlns:w16sdtfl="http://schemas.microsoft.com/office/word/2024/wordml/sdtformatlock" xmlns:w16se="http://schemas.microsoft.com/office/word/2015/wordml/symex" xmlns:wpg="http://schemas.microsoft.com/office/word/2010/wordprocessingGroup" xmlns:wpi="http://schemas.microsoft.com/office/word/2010/wordprocessingInk" xmlns:wne="http://schemas.microsoft.com/office/word/2006/wordml" xmlns:wps="http://schemas.microsoft.com/office/word/2010/wordprocessingShape" mc:Ignorable="w14 w15 w16se w16cid w16 w16cex w16sdtdh w16sdtfl w16du wp14">
   <w:abstractNum w:abstractNumId="0" w15:restartNumberingAfterBreak="0">
+    <w:nsid w:val="15910C8E"/>
+    <w:multiLevelType w:val="multilevel"/>
+    <w:tmpl w:val="0EE6043E"/>
+    <w:lvl w:ilvl="0">
+      <w:start w:val="1"/>
+      <w:numFmt w:val="bullet"/>
+      <w:lvlText w:val="●"/>
+      <w:lvlJc w:val="left"/>
+      <w:pPr>
+        <w:ind w:left="720" w:hanging="360"/>
+      </w:pPr>
+    </w:lvl>
+    <w:lvl w:ilvl="1">
+      <w:start w:val="1"/>
+      <w:numFmt w:val="bullet"/>
+      <w:lvlText w:val="○"/>
+      <w:lvlJc w:val="left"/>
+      <w:pPr>
+        <w:ind w:left="1440" w:hanging="360"/>
+      </w:pPr>
+    </w:lvl>
+    <w:lvl w:ilvl="2">
+      <w:start w:val="1"/>
+      <w:numFmt w:val="bullet"/>
+      <w:lvlText w:val="■"/>
+      <w:lvlJc w:val="left"/>
+      <w:pPr>
+        <w:ind w:left="2160" w:hanging="360"/>
+      </w:pPr>
+    </w:lvl>
+    <w:lvl w:ilvl="3">
+      <w:start w:val="1"/>
+      <w:numFmt w:val="bullet"/>
+      <w:lvlText w:val="●"/>
+      <w:lvlJc w:val="left"/>
+      <w:pPr>
+        <w:ind w:left="2880" w:hanging="360"/>
+      </w:pPr>
+    </w:lvl>
+    <w:lvl w:ilvl="4">
+      <w:start w:val="1"/>
+      <w:numFmt w:val="bullet"/>
+      <w:lvlText w:val="○"/>
+      <w:lvlJc w:val="left"/>
+      <w:pPr>
+        <w:ind w:left="3600" w:hanging="360"/>
+      </w:pPr>
+    </w:lvl>
+    <w:lvl w:ilvl="5">
+      <w:start w:val="1"/>
+      <w:numFmt w:val="bullet"/>
+      <w:lvlText w:val="■"/>
+      <w:lvlJc w:val="left"/>
+      <w:pPr>
+        <w:ind w:left="4320" w:hanging="360"/>
+      </w:pPr>
+    </w:lvl>
+    <w:lvl w:ilvl="6">
+      <w:start w:val="1"/>
+      <w:numFmt w:val="bullet"/>
+      <w:lvlText w:val="●"/>
+      <w:lvlJc w:val="left"/>
+      <w:pPr>
+        <w:ind w:left="5040" w:hanging="360"/>
+      </w:pPr>
+    </w:lvl>
+    <w:lvl w:ilvl="7">
+      <w:start w:val="1"/>
+      <w:numFmt w:val="bullet"/>
+      <w:lvlText w:val="●"/>
+      <w:lvlJc w:val="left"/>
+      <w:pPr>
+        <w:ind w:left="5760" w:hanging="360"/>
+      </w:pPr>
+    </w:lvl>
+    <w:lvl w:ilvl="8">
+      <w:start w:val="1"/>
+      <w:numFmt w:val="bullet"/>
+      <w:lvlText w:val="●"/>
+      <w:lvlJc w:val="left"/>
+      <w:pPr>
+        <w:ind w:left="6480" w:hanging="360"/>
+      </w:pPr>
+    </w:lvl>
+  </w:abstractNum>
+  <w:abstractNum w:abstractNumId="1" w15:restartNumberingAfterBreak="0">
     <w:nsid w:val="1A223603"/>
     <w:multiLevelType w:val="multilevel"/>
     <w:tmpl w:val="0EE6043E"/>
@@ -1797,7 +1902,7 @@
       </w:pPr>
     </w:lvl>
   </w:abstractNum>
-  <w:abstractNum w:abstractNumId="1" w15:restartNumberingAfterBreak="0">
+  <w:abstractNum w:abstractNumId="2" w15:restartNumberingAfterBreak="0">
     <w:nsid w:val="70472747"/>
     <w:multiLevelType w:val="hybridMultilevel"/>
     <w:tmpl w:val="0EE6043E"/>
@@ -1884,15 +1989,18 @@
     </w:lvl>
   </w:abstractNum>
   <w:num w:numId="1" w16cid:durableId="618336517">
-    <w:abstractNumId w:val="1"/>
+    <w:abstractNumId w:val="2"/>
     <w:lvlOverride w:ilvl="0">
       <w:startOverride w:val="1"/>
     </w:lvlOverride>
   </w:num>
   <w:num w:numId="2" w16cid:durableId="1187405654">
+    <w:abstractNumId w:val="2"/>
+  </w:num>
+  <w:num w:numId="3" w16cid:durableId="40861117">
     <w:abstractNumId w:val="1"/>
   </w:num>
-  <w:num w:numId="3" w16cid:durableId="40861117">
+  <w:num w:numId="4" w16cid:durableId="1555656544">
     <w:abstractNumId w:val="0"/>
   </w:num>
 </w:numbering>

</xml_diff>